<commit_message>
Report: typographic apostrophes in prose; precise wording for hybrid inference saving
Co-authored-by: arena-agent <297053741+arena-agent@users.noreply.github.com>
</commit_message>
<xml_diff>
--- a/backend/review2/Pagewise_Review2_Report_24BDS0316.docx
+++ b/backend/review2/Pagewise_Review2_Report_24BDS0316.docx
@@ -336,7 +336,7 @@
     </w:p>
     <w:p>
       <w:r>
-        <w:t>Given a static, read-only SQLite database and a mixed workload of indexed point lookups, joins, range scans and recursive traversals, the system must — on every observed page request — predict which page(s) will be demanded next, prefetch them into a bounded page cache that sits beneath SQLite's own pager, and quantify (a) the prediction accuracy of a semantic predictor relative to an otherwise identical history-only predictor and to simple statistical baselines, and (b) the resulting change in per-query latency under a controlled cache budget and a controlled storage-latency model.</w:t>
+        <w:t>Given a static, read-only SQLite database and a mixed workload of indexed point lookups, joins, range scans and recursive traversals, the system must — on every observed page request — predict which page(s) will be demanded next, prefetch them into a bounded page cache that sits beneath SQLite’s own pager, and quantify (a) the prediction accuracy of a semantic predictor relative to an otherwise identical history-only predictor and to simple statistical baselines, and (b) the resulting change in per-query latency under a controlled cache budget and a controlled storage-latency model.</w:t>
       </w:r>
     </w:p>
     <w:p>
@@ -573,7 +573,7 @@
         <w:jc w:val="left"/>
       </w:pPr>
       <w:r>
-        <w:t>3. Implement a bounded-cache asynchronous prefetch runtime beneath SQLite's pager with a controllable storage-latency model and complete per-job diagnostics.</w:t>
+        <w:t>3. Implement a bounded-cache asynchronous prefetch runtime beneath SQLite’s pager with a controllable storage-latency model and complete per-job diagnostics.</w:t>
       </w:r>
     </w:p>
     <w:p>
@@ -647,7 +647,7 @@
         <w:t>not</w:t>
       </w:r>
       <w:r>
-        <w:t xml:space="preserve"> a complete logical page-reference trace: SQLite's own page cache satisfies many requests before they reach the VFS, and a VFS read does not prove that physical disk I/O occurred.</w:t>
+        <w:t xml:space="preserve"> a complete logical page-reference trace: SQLite’s own page cache satisfies many requests before they reach the VFS, and a VFS read does not prove that physical disk I/O occurred.</w:t>
       </w:r>
     </w:p>
     <w:p>
@@ -1712,7 +1712,7 @@
               <w:rPr>
                 <w:sz w:val="19"/>
               </w:rPr>
-              <w:t xml:space="preserve"> on the main database file and tags it with the executing query's context; </w:t>
+              <w:t xml:space="preserve"> on the main database file and tags it with the executing query’s context; </w:t>
             </w:r>
             <w:r>
               <w:rPr>
@@ -2130,7 +2130,7 @@
               <w:rPr>
                 <w:sz w:val="19"/>
               </w:rPr>
-              <w:t>Bounded LRU cache beneath SQLite's pager, an asynchronous prediction queue served by a worker pool, and a simulated storage device with a shared (serialised) or independent latency model.</w:t>
+              <w:t>Bounded LRU cache beneath SQLite’s pager, an asynchronous prediction queue served by a worker pool, and a simulated storage device with a shared (serialised) or independent latency model.</w:t>
             </w:r>
           </w:p>
         </w:tc>
@@ -2366,7 +2366,7 @@
         <w:t>runner.py</w:t>
       </w:r>
       <w:r>
-        <w:t xml:space="preserve">) opens the database read-only through an APSW connection whose VFS is the project's </w:t>
+        <w:t xml:space="preserve">) opens the database read-only through an APSW connection whose VFS is the project’s </w:t>
       </w:r>
       <w:r>
         <w:rPr>
@@ -2396,7 +2396,7 @@
         <w:t>PRAGMA cache_size</w:t>
       </w:r>
       <w:r>
-        <w:t xml:space="preserve">), so page requests that miss SQLite's pager reach </w:t>
+        <w:t xml:space="preserve">), so page requests that miss SQLite’s pager reach </w:t>
       </w:r>
       <w:r>
         <w:rPr>
@@ -2406,7 +2406,7 @@
         <w:t>TraceVFSFile.xRead</w:t>
       </w:r>
       <w:r>
-        <w:t xml:space="preserve">. Before each query the driver publishes a context record (query identifier, template, workload family, plan class) through a context variable; every intercepted read is tagged with it. Each read's byte range is converted to page numbers and looked up in the </w:t>
+        <w:t xml:space="preserve">. Before each query the driver publishes a context record (query identifier, template, workload family, plan class) through a context variable; every intercepted read is tagged with it. Each read’s byte range is converted to page numbers and looked up in the </w:t>
       </w:r>
       <w:r>
         <w:rPr>
@@ -2935,7 +2935,7 @@
               <w:rPr>
                 <w:sz w:val="19"/>
               </w:rPr>
-              <w:t>Custom bounded cache beneath SQLite's pager rather than patching SQLite</w:t>
+              <w:t>Custom bounded cache beneath SQLite’s pager rather than patching SQLite</w:t>
             </w:r>
           </w:p>
         </w:tc>
@@ -3760,7 +3760,7 @@
         <w:t>dbstat</w:t>
       </w:r>
       <w:r>
-        <w:t xml:space="preserve"> virtual table [2] (stdlib SQLite first, APSW's SQLite as a fallback) and records, for each page, the owning object, B-tree path, page type (interior/leaf/overflow) and depth. </w:t>
+        <w:t xml:space="preserve"> virtual table [2] (stdlib SQLite first, APSW’s SQLite as a fallback) and records, for each page, the owning object, B-tree path, page type (interior/leaf/overflow) and depth. </w:t>
       </w:r>
       <w:r>
         <w:rPr>
@@ -8131,7 +8131,7 @@
     </w:p>
     <w:p>
       <w:r>
-        <w:t>Figure 4 and Table 9 report accuracy on the held-out split of the frozen trace (45 test executions, 919 next-page prediction points). Semantic features improve the neural ranker substantially — Model B reaches 28.1% top-1 against 17.2% for the otherwise identical Model A — but the second-order Markov table is the most accurate predictor at 53.1% top-1, and the first-order table has the best top-5 accuracy (73.6%). Both MLPs are bounded by the candidate generator's recall of 82.5%.</w:t>
+        <w:t>Figure 4 and Table 9 report accuracy on the held-out split of the frozen trace (45 test executions, 919 next-page prediction points). Semantic features improve the neural ranker substantially — Model B reaches 28.1% top-1 against 17.2% for the otherwise identical Model A — but the second-order Markov table is the most accurate predictor at 53.1% top-1, and the first-order table has the best top-5 accuracy (73.6%). Both MLPs are bounded by the candidate generator’s recall of 82.5%.</w:t>
       </w:r>
     </w:p>
     <w:p>
@@ -12152,7 +12152,7 @@
         <w:jc w:val="left"/>
       </w:pPr>
       <w:r>
-        <w:t xml:space="preserve">The hybrid gate cuts Model B's inference time by roughly half in every category; in the earlier three-seed development validation (200 queries per seed) it reduced Model B inference from 979.9 ms to 403.1 ms per run and achieved a −3.19 ms paired delta versus </w:t>
+        <w:t xml:space="preserve">The hybrid gate cuts Model B’s inference time by half or more in every category; in the earlier three-seed development validation (200 queries per seed) it reduced Model B inference from 979.9 ms to 403.1 ms per run and achieved a −3.19 ms paired delta versus </w:t>
       </w:r>
       <w:r>
         <w:rPr>
@@ -12785,7 +12785,7 @@
         <w:keepNext/>
       </w:pPr>
       <w:r>
-        <w:t>Taken together, the evidence supports a precise and modest claim: semantic page metadata — object identity in particular — carries real predictive signal for SQLite page sequences, but on this workload the signal is captured at least as well by a second-order or context-keyed transition table whose cost is negligible, and the neural ranker's inference cost cancels its benefit at sub-millisecond storage latencies. The main threats to validity are:</w:t>
+        <w:t>Taken together, the evidence supports a precise and modest claim: semantic page metadata — object identity in particular — carries real predictive signal for SQLite page sequences, but on this workload the signal is captured at least as well by a second-order or context-keyed transition table whose cost is negligible, and the neural ranker’s inference cost cancels its benefit at sub-millisecond storage latencies. The main threats to validity are:</w:t>
       </w:r>
     </w:p>
     <w:p>

</xml_diff>